<commit_message>
Add iteration 3 folder and meeting minutes #1
</commit_message>
<xml_diff>
--- a/Iteration 2/Resource_Table.docx
+++ b/Iteration 2/Resource_Table.docx
@@ -1373,6 +1373,7 @@
                 <w:szCs w:val="24"/>
                 <w:lang w:val="en-NZ"/>
               </w:rPr>
+              <w:lastRenderedPageBreak/>
               <w:t>$1800</w:t>
             </w:r>
           </w:p>
@@ -1416,6 +1417,7 @@
                 <w:szCs w:val="24"/>
                 <w:lang w:val="en-NZ"/>
               </w:rPr>
+              <w:lastRenderedPageBreak/>
               <w:t>1.0</w:t>
             </w:r>
           </w:p>
@@ -2119,7 +2121,16 @@
                 <w:szCs w:val="24"/>
                 <w:lang w:val="en-NZ"/>
               </w:rPr>
-              <w:t>2.0</w:t>
+              <w:t>2</w:t>
+            </w:r>
+            <w:r>
+              <w:rPr>
+                <w:rFonts w:ascii="Times New Roman" w:eastAsia="Times New Roman" w:hAnsi="Times New Roman" w:cs="Times New Roman"/>
+                <w:sz w:val="24"/>
+                <w:szCs w:val="24"/>
+                <w:lang w:val="en-NZ"/>
+              </w:rPr>
+              <w:t>.0</w:t>
             </w:r>
           </w:p>
         </w:tc>
@@ -2822,44 +2833,63 @@
                 <w:szCs w:val="24"/>
                 <w:lang w:val="en-NZ"/>
               </w:rPr>
-              <w:t>3.0</w:t>
-            </w:r>
-          </w:p>
-        </w:tc>
-        <w:tc>
-          <w:tcPr>
-            <w:tcW w:w="0" w:type="auto"/>
-            <w:tcBorders>
-              <w:top w:val="single" w:sz="6" w:space="0" w:color="000000"/>
-              <w:left w:val="single" w:sz="6" w:space="0" w:color="000000"/>
-              <w:bottom w:val="single" w:sz="6" w:space="0" w:color="000000"/>
-              <w:right w:val="single" w:sz="6" w:space="0" w:color="000000"/>
-            </w:tcBorders>
-            <w:tcMar>
-              <w:top w:w="0" w:type="dxa"/>
-              <w:left w:w="100" w:type="dxa"/>
-              <w:bottom w:w="0" w:type="dxa"/>
-              <w:right w:w="100" w:type="dxa"/>
-            </w:tcMar>
-          </w:tcPr>
-          <w:p>
-            <w:pPr>
-              <w:spacing w:before="240" w:after="0" w:line="240" w:lineRule="auto"/>
-              <w:rPr>
-                <w:rFonts w:ascii="Times New Roman" w:eastAsia="Times New Roman" w:hAnsi="Times New Roman" w:cs="Times New Roman"/>
-                <w:sz w:val="24"/>
-                <w:szCs w:val="24"/>
-                <w:lang w:val="en-NZ"/>
-              </w:rPr>
-            </w:pPr>
-            <w:r>
-              <w:rPr>
-                <w:rFonts w:ascii="Times New Roman" w:eastAsia="Times New Roman" w:hAnsi="Times New Roman" w:cs="Times New Roman"/>
-                <w:sz w:val="24"/>
-                <w:szCs w:val="24"/>
-                <w:lang w:val="en-NZ"/>
-              </w:rPr>
-              <w:t>Website Design reviews</w:t>
+              <w:lastRenderedPageBreak/>
+              <w:t>3</w:t>
+            </w:r>
+            <w:r>
+              <w:rPr>
+                <w:rFonts w:ascii="Times New Roman" w:eastAsia="Times New Roman" w:hAnsi="Times New Roman" w:cs="Times New Roman"/>
+                <w:sz w:val="24"/>
+                <w:szCs w:val="24"/>
+                <w:lang w:val="en-NZ"/>
+              </w:rPr>
+              <w:t>.0</w:t>
+            </w:r>
+          </w:p>
+        </w:tc>
+        <w:tc>
+          <w:tcPr>
+            <w:tcW w:w="0" w:type="auto"/>
+            <w:tcBorders>
+              <w:top w:val="single" w:sz="6" w:space="0" w:color="000000"/>
+              <w:left w:val="single" w:sz="6" w:space="0" w:color="000000"/>
+              <w:bottom w:val="single" w:sz="6" w:space="0" w:color="000000"/>
+              <w:right w:val="single" w:sz="6" w:space="0" w:color="000000"/>
+            </w:tcBorders>
+            <w:tcMar>
+              <w:top w:w="0" w:type="dxa"/>
+              <w:left w:w="100" w:type="dxa"/>
+              <w:bottom w:w="0" w:type="dxa"/>
+              <w:right w:w="100" w:type="dxa"/>
+            </w:tcMar>
+          </w:tcPr>
+          <w:p>
+            <w:pPr>
+              <w:spacing w:before="240" w:after="0" w:line="240" w:lineRule="auto"/>
+              <w:rPr>
+                <w:rFonts w:ascii="Times New Roman" w:eastAsia="Times New Roman" w:hAnsi="Times New Roman" w:cs="Times New Roman"/>
+                <w:sz w:val="24"/>
+                <w:szCs w:val="24"/>
+                <w:lang w:val="en-NZ"/>
+              </w:rPr>
+            </w:pPr>
+            <w:r>
+              <w:rPr>
+                <w:rFonts w:ascii="Times New Roman" w:eastAsia="Times New Roman" w:hAnsi="Times New Roman" w:cs="Times New Roman"/>
+                <w:sz w:val="24"/>
+                <w:szCs w:val="24"/>
+                <w:lang w:val="en-NZ"/>
+              </w:rPr>
+              <w:t>Website Design</w:t>
+            </w:r>
+            <w:r>
+              <w:rPr>
+                <w:rFonts w:ascii="Times New Roman" w:eastAsia="Times New Roman" w:hAnsi="Times New Roman" w:cs="Times New Roman"/>
+                <w:sz w:val="24"/>
+                <w:szCs w:val="24"/>
+                <w:lang w:val="en-NZ"/>
+              </w:rPr>
+              <w:t xml:space="preserve"> reviews</w:t>
             </w:r>
           </w:p>
         </w:tc>
@@ -2933,86 +2963,140 @@
                 <w:szCs w:val="24"/>
                 <w:lang w:val="en-NZ"/>
               </w:rPr>
-              <w:t>1x5 hours</w:t>
-            </w:r>
-          </w:p>
-        </w:tc>
-        <w:tc>
-          <w:tcPr>
-            <w:tcW w:w="0" w:type="auto"/>
-            <w:tcBorders>
-              <w:top w:val="single" w:sz="6" w:space="0" w:color="000000"/>
-              <w:left w:val="single" w:sz="6" w:space="0" w:color="000000"/>
-              <w:bottom w:val="single" w:sz="6" w:space="0" w:color="000000"/>
-              <w:right w:val="single" w:sz="6" w:space="0" w:color="000000"/>
-            </w:tcBorders>
-          </w:tcPr>
-          <w:p>
-            <w:pPr>
-              <w:spacing w:before="240" w:after="0" w:line="240" w:lineRule="auto"/>
-              <w:rPr>
-                <w:rFonts w:ascii="Times New Roman" w:eastAsia="Times New Roman" w:hAnsi="Times New Roman" w:cs="Times New Roman"/>
-                <w:sz w:val="24"/>
-                <w:szCs w:val="24"/>
-                <w:lang w:val="en-NZ"/>
-              </w:rPr>
-            </w:pPr>
-          </w:p>
-        </w:tc>
-        <w:tc>
-          <w:tcPr>
-            <w:tcW w:w="0" w:type="auto"/>
-            <w:tcBorders>
-              <w:top w:val="single" w:sz="6" w:space="0" w:color="000000"/>
-              <w:left w:val="single" w:sz="6" w:space="0" w:color="000000"/>
-              <w:bottom w:val="single" w:sz="6" w:space="0" w:color="000000"/>
-              <w:right w:val="single" w:sz="6" w:space="0" w:color="000000"/>
-            </w:tcBorders>
-            <w:tcMar>
-              <w:top w:w="0" w:type="dxa"/>
-              <w:left w:w="100" w:type="dxa"/>
-              <w:bottom w:w="0" w:type="dxa"/>
-              <w:right w:w="100" w:type="dxa"/>
-            </w:tcMar>
-          </w:tcPr>
-          <w:p>
-            <w:pPr>
-              <w:spacing w:before="240" w:after="0" w:line="240" w:lineRule="auto"/>
-              <w:rPr>
-                <w:rFonts w:ascii="Times New Roman" w:eastAsia="Times New Roman" w:hAnsi="Times New Roman" w:cs="Times New Roman"/>
-                <w:sz w:val="24"/>
-                <w:szCs w:val="24"/>
-                <w:lang w:val="en-NZ"/>
-              </w:rPr>
-            </w:pPr>
-            <w:r>
-              <w:rPr>
-                <w:rFonts w:ascii="Times New Roman" w:eastAsia="Times New Roman" w:hAnsi="Times New Roman" w:cs="Times New Roman"/>
-                <w:sz w:val="24"/>
-                <w:szCs w:val="24"/>
-                <w:lang w:val="en-NZ"/>
-              </w:rPr>
-              <w:t xml:space="preserve">1x5 x$80 = </w:t>
-            </w:r>
-          </w:p>
-          <w:p>
-            <w:pPr>
-              <w:spacing w:before="240" w:after="0" w:line="240" w:lineRule="auto"/>
-              <w:rPr>
-                <w:rFonts w:ascii="Times New Roman" w:eastAsia="Times New Roman" w:hAnsi="Times New Roman" w:cs="Times New Roman"/>
-                <w:sz w:val="24"/>
-                <w:szCs w:val="24"/>
-                <w:lang w:val="en-NZ"/>
-              </w:rPr>
-            </w:pPr>
-            <w:r>
-              <w:rPr>
-                <w:rFonts w:ascii="Times New Roman" w:eastAsia="Times New Roman" w:hAnsi="Times New Roman" w:cs="Times New Roman"/>
-                <w:sz w:val="24"/>
-                <w:szCs w:val="24"/>
-                <w:lang w:val="en-NZ"/>
-              </w:rPr>
-              <w:t>$400</w:t>
+              <w:t>1x</w:t>
+            </w:r>
+            <w:r>
+              <w:rPr>
+                <w:rFonts w:ascii="Times New Roman" w:eastAsia="Times New Roman" w:hAnsi="Times New Roman" w:cs="Times New Roman"/>
+                <w:sz w:val="24"/>
+                <w:szCs w:val="24"/>
+                <w:lang w:val="en-NZ"/>
+              </w:rPr>
+              <w:t>5</w:t>
+            </w:r>
+            <w:r>
+              <w:rPr>
+                <w:rFonts w:ascii="Times New Roman" w:eastAsia="Times New Roman" w:hAnsi="Times New Roman" w:cs="Times New Roman"/>
+                <w:sz w:val="24"/>
+                <w:szCs w:val="24"/>
+                <w:lang w:val="en-NZ"/>
+              </w:rPr>
+              <w:t xml:space="preserve"> hours</w:t>
+            </w:r>
+          </w:p>
+        </w:tc>
+        <w:tc>
+          <w:tcPr>
+            <w:tcW w:w="0" w:type="auto"/>
+            <w:tcBorders>
+              <w:top w:val="single" w:sz="6" w:space="0" w:color="000000"/>
+              <w:left w:val="single" w:sz="6" w:space="0" w:color="000000"/>
+              <w:bottom w:val="single" w:sz="6" w:space="0" w:color="000000"/>
+              <w:right w:val="single" w:sz="6" w:space="0" w:color="000000"/>
+            </w:tcBorders>
+          </w:tcPr>
+          <w:p>
+            <w:pPr>
+              <w:spacing w:before="240" w:after="0" w:line="240" w:lineRule="auto"/>
+              <w:rPr>
+                <w:rFonts w:ascii="Times New Roman" w:eastAsia="Times New Roman" w:hAnsi="Times New Roman" w:cs="Times New Roman"/>
+                <w:sz w:val="24"/>
+                <w:szCs w:val="24"/>
+                <w:lang w:val="en-NZ"/>
+              </w:rPr>
+            </w:pPr>
+          </w:p>
+        </w:tc>
+        <w:tc>
+          <w:tcPr>
+            <w:tcW w:w="0" w:type="auto"/>
+            <w:tcBorders>
+              <w:top w:val="single" w:sz="6" w:space="0" w:color="000000"/>
+              <w:left w:val="single" w:sz="6" w:space="0" w:color="000000"/>
+              <w:bottom w:val="single" w:sz="6" w:space="0" w:color="000000"/>
+              <w:right w:val="single" w:sz="6" w:space="0" w:color="000000"/>
+            </w:tcBorders>
+            <w:tcMar>
+              <w:top w:w="0" w:type="dxa"/>
+              <w:left w:w="100" w:type="dxa"/>
+              <w:bottom w:w="0" w:type="dxa"/>
+              <w:right w:w="100" w:type="dxa"/>
+            </w:tcMar>
+          </w:tcPr>
+          <w:p>
+            <w:pPr>
+              <w:spacing w:before="240" w:after="0" w:line="240" w:lineRule="auto"/>
+              <w:rPr>
+                <w:rFonts w:ascii="Times New Roman" w:eastAsia="Times New Roman" w:hAnsi="Times New Roman" w:cs="Times New Roman"/>
+                <w:sz w:val="24"/>
+                <w:szCs w:val="24"/>
+                <w:lang w:val="en-NZ"/>
+              </w:rPr>
+            </w:pPr>
+            <w:r>
+              <w:rPr>
+                <w:rFonts w:ascii="Times New Roman" w:eastAsia="Times New Roman" w:hAnsi="Times New Roman" w:cs="Times New Roman"/>
+                <w:sz w:val="24"/>
+                <w:szCs w:val="24"/>
+                <w:lang w:val="en-NZ"/>
+              </w:rPr>
+              <w:t>1x</w:t>
+            </w:r>
+            <w:r>
+              <w:rPr>
+                <w:rFonts w:ascii="Times New Roman" w:eastAsia="Times New Roman" w:hAnsi="Times New Roman" w:cs="Times New Roman"/>
+                <w:sz w:val="24"/>
+                <w:szCs w:val="24"/>
+                <w:lang w:val="en-NZ"/>
+              </w:rPr>
+              <w:t>5</w:t>
+            </w:r>
+            <w:r>
+              <w:rPr>
+                <w:rFonts w:ascii="Times New Roman" w:eastAsia="Times New Roman" w:hAnsi="Times New Roman" w:cs="Times New Roman"/>
+                <w:sz w:val="24"/>
+                <w:szCs w:val="24"/>
+                <w:lang w:val="en-NZ"/>
+              </w:rPr>
+              <w:t xml:space="preserve"> x$80 = </w:t>
+            </w:r>
+          </w:p>
+          <w:p>
+            <w:pPr>
+              <w:spacing w:before="240" w:after="0" w:line="240" w:lineRule="auto"/>
+              <w:rPr>
+                <w:rFonts w:ascii="Times New Roman" w:eastAsia="Times New Roman" w:hAnsi="Times New Roman" w:cs="Times New Roman"/>
+                <w:sz w:val="24"/>
+                <w:szCs w:val="24"/>
+                <w:lang w:val="en-NZ"/>
+              </w:rPr>
+            </w:pPr>
+            <w:r>
+              <w:rPr>
+                <w:rFonts w:ascii="Times New Roman" w:eastAsia="Times New Roman" w:hAnsi="Times New Roman" w:cs="Times New Roman"/>
+                <w:sz w:val="24"/>
+                <w:szCs w:val="24"/>
+                <w:lang w:val="en-NZ"/>
+              </w:rPr>
+              <w:t>$</w:t>
+            </w:r>
+            <w:r>
+              <w:rPr>
+                <w:rFonts w:ascii="Times New Roman" w:eastAsia="Times New Roman" w:hAnsi="Times New Roman" w:cs="Times New Roman"/>
+                <w:sz w:val="24"/>
+                <w:szCs w:val="24"/>
+                <w:lang w:val="en-NZ"/>
+              </w:rPr>
+              <w:t>4</w:t>
+            </w:r>
+            <w:r>
+              <w:rPr>
+                <w:rFonts w:ascii="Times New Roman" w:eastAsia="Times New Roman" w:hAnsi="Times New Roman" w:cs="Times New Roman"/>
+                <w:sz w:val="24"/>
+                <w:szCs w:val="24"/>
+                <w:lang w:val="en-NZ"/>
+              </w:rPr>
+              <w:t>00</w:t>
             </w:r>
           </w:p>
         </w:tc>
@@ -4359,6 +4443,8 @@
   <w:style w:type="table" w:default="1" w:styleId="TableNormal">
     <w:name w:val="Normal Table"/>
     <w:uiPriority w:val="99"/>
+    <w:semiHidden/>
+    <w:unhideWhenUsed/>
     <w:tblPr>
       <w:tblInd w:w="0" w:type="dxa"/>
       <w:tblCellMar>
@@ -4788,28 +4874,28 @@
 </file>
 
 <file path=customXml/item1.xml><?xml version="1.0" encoding="utf-8"?>
-<b:Sources xmlns:b="http://schemas.openxmlformats.org/officeDocument/2006/bibliography" xmlns="http://schemas.openxmlformats.org/officeDocument/2006/bibliography" SelectedStyle="\APASixthEditionOfficeOnline.xsl" StyleName="APA" Version="6"/>
-</file>
-
-<file path=customXml/item2.xml><?xml version="1.0" encoding="utf-8"?>
 <go:gDocsCustomXmlDataStorage xmlns:go="http://customooxmlschemas.google.com/" xmlns:r="http://schemas.openxmlformats.org/officeDocument/2006/relationships" uri="GoogleDocsCustomDataVersion1">
   <go:docsCustomData xmlns:go="http://customooxmlschemas.google.com/" roundtripDataSignature="AMtx7mhf4TK9RM9+0bYDQZULUqDXNFXatQ==">AMUW2mWz97feoN/kZ6YDB/u/zPmkKVXbX19bGgimqAgyB6HnkcoUcqGe/kF7iH3MzOGxwfTWm3tUotiKKndNCK8ElNSKNW+rX9S21dCiMeZiRdEEWncDf0oxNM0tcakA1U4G572rsyGv</go:docsCustomData>
 </go:gDocsCustomXmlDataStorage>
 </file>
 
-<file path=customXml/itemProps1.xml><?xml version="1.0" encoding="utf-8"?>
-<ds:datastoreItem xmlns:ds="http://schemas.openxmlformats.org/officeDocument/2006/customXml" ds:itemID="{68D9BB01-EC36-448B-93A5-19E9AE333F82}">
-  <ds:schemaRefs>
-    <ds:schemaRef ds:uri="http://schemas.openxmlformats.org/officeDocument/2006/bibliography"/>
-  </ds:schemaRefs>
-</ds:datastoreItem>
+<file path=customXml/item2.xml><?xml version="1.0" encoding="utf-8"?>
+<b:Sources xmlns:b="http://schemas.openxmlformats.org/officeDocument/2006/bibliography" xmlns="http://schemas.openxmlformats.org/officeDocument/2006/bibliography" SelectedStyle="/APASixthEditionOfficeOnline.xsl" StyleName="APA" Version="6"/>
 </file>
 
-<file path=customXml/itemProps2.xml><?xml version="1.0" encoding="utf-8"?>
+<file path=customXml/itemProps1.xml><?xml version="1.0" encoding="utf-8"?>
 <ds:datastoreItem xmlns:ds="http://schemas.openxmlformats.org/officeDocument/2006/customXml" ds:itemID="{11111111-1234-1234-1234-123412341234}">
   <ds:schemaRefs>
     <ds:schemaRef ds:uri="http://customooxmlschemas.google.com/"/>
     <ds:schemaRef ds:uri="http://schemas.openxmlformats.org/officeDocument/2006/relationships"/>
   </ds:schemaRefs>
 </ds:datastoreItem>
+</file>
+
+<file path=customXml/itemProps2.xml><?xml version="1.0" encoding="utf-8"?>
+<ds:datastoreItem xmlns:ds="http://schemas.openxmlformats.org/officeDocument/2006/customXml" ds:itemID="{DC18B033-800D-9644-A9E3-7B97B9FB25F0}">
+  <ds:schemaRefs>
+    <ds:schemaRef ds:uri="http://schemas.openxmlformats.org/officeDocument/2006/bibliography"/>
+  </ds:schemaRefs>
+</ds:datastoreItem>
 </file>
</xml_diff>